<commit_message>
2.3.4-rasm namunasi: ixcham, yorqin ranglar
Co-Authored-By: Claude Opus 5.5 <noreply@anthropic.com>
Claude-Session: https://claude.ai/code/session_01PxHTC8Q7yHdrpAeUA5KUgM
</commit_message>
<xml_diff>
--- a/Namuna_2.3.4-rasm.docx
+++ b/Namuna_2.3.4-rasm.docx
@@ -26,7 +26,7 @@
         </w:rPr>
         <w:drawing>
           <wp:inline distT="0" distB="0" distL="0" distR="0">
-            <wp:extent cx="5940000" cy="3780000"/>
+            <wp:extent cx="5400000" cy="2700000"/>
             <wp:effectExtent l="0" t="0" r="0" b="0"/>
             <wp:docPr id="1001" name="2.3.4-rasm"/>
             <wp:cNvGraphicFramePr/>
@@ -24037,7 +24037,7 @@
           </c:tx>
           <c:spPr>
             <a:solidFill>
-              <a:srgbClr val="70AD47"/>
+              <a:srgbClr val="00B050"/>
             </a:solidFill>
             <a:ln w="6350">
               <a:solidFill>
@@ -24061,7 +24061,7 @@
                 <a:pPr>
                   <a:defRPr sz="1050" b="1">
                     <a:solidFill>
-                      <a:srgbClr val="FFFFFF"/>
+                      <a:srgbClr val="000000"/>
                     </a:solidFill>
                     <a:latin typeface="Times New Roman"/>
                     <a:cs typeface="Times New Roman"/>
@@ -24147,7 +24147,7 @@
           </c:tx>
           <c:spPr>
             <a:solidFill>
-              <a:srgbClr val="FFC000"/>
+              <a:srgbClr val="FFE14D"/>
             </a:solidFill>
             <a:ln w="6350">
               <a:solidFill>
@@ -24257,7 +24257,7 @@
           </c:tx>
           <c:spPr>
             <a:solidFill>
-              <a:srgbClr val="ED7D31"/>
+              <a:srgbClr val="FFA726"/>
             </a:solidFill>
             <a:ln w="6350">
               <a:solidFill>
@@ -24281,7 +24281,7 @@
                 <a:pPr>
                   <a:defRPr sz="1050" b="1">
                     <a:solidFill>
-                      <a:srgbClr val="FFFFFF"/>
+                      <a:srgbClr val="000000"/>
                     </a:solidFill>
                     <a:latin typeface="Times New Roman"/>
                     <a:cs typeface="Times New Roman"/>
@@ -24367,7 +24367,7 @@
           </c:tx>
           <c:spPr>
             <a:solidFill>
-              <a:srgbClr val="C00000"/>
+              <a:srgbClr val="FF5050"/>
             </a:solidFill>
             <a:ln w="6350">
               <a:solidFill>
@@ -24391,7 +24391,7 @@
                 <a:pPr>
                   <a:defRPr sz="1050" b="1">
                     <a:solidFill>
-                      <a:srgbClr val="FFFFFF"/>
+                      <a:srgbClr val="000000"/>
                     </a:solidFill>
                     <a:latin typeface="Times New Roman"/>
                     <a:cs typeface="Times New Roman"/>
@@ -24477,7 +24477,7 @@
           </c:tx>
           <c:spPr>
             <a:solidFill>
-              <a:srgbClr val="7F1F1F"/>
+              <a:srgbClr val="C00000"/>
             </a:solidFill>
             <a:ln w="6350">
               <a:solidFill>
@@ -24575,7 +24575,7 @@
             </c:numRef>
           </c:val>
         </c:ser>
-        <c:gapWidth val="45"/>
+        <c:gapWidth val="60"/>
         <c:overlap val="100"/>
         <c:axId val="111"/>
         <c:axId val="222"/>
@@ -24662,7 +24662,7 @@
                     </a:solidFill>
                     <a:latin typeface="Times New Roman"/>
                   </a:rPr>
-                  <a:t>3-bosqich kreditlariga nisbatan, %</a:t>
+                  <a:t>%</a:t>
                 </a:r>
               </a:p>
             </c:rich>
@@ -24709,7 +24709,7 @@
       </c:spPr>
     </c:plotArea>
     <c:legend>
-      <c:legendPos val="r"/>
+      <c:legendPos val="b"/>
       <c:overlay val="0"/>
       <c:txPr>
         <a:bodyPr/>

</xml_diff>

<commit_message>
2.3.4-rasm namunasi: 2023 umidsiz yorlig‘i ko‘rinadi
Co-Authored-By: Claude Opus 5.5 <noreply@anthropic.com>
Claude-Session: https://claude.ai/code/session_01PxHTC8Q7yHdrpAeUA5KUgM
</commit_message>
<xml_diff>
--- a/Namuna_2.3.4-rasm.docx
+++ b/Namuna_2.3.4-rasm.docx
@@ -24489,7 +24489,42 @@
           <c:dLbls>
             <c:dLbl>
               <c:idx val="2"/>
-              <c:delete val="1"/>
+              <c:layout>
+                <c:manualLayout>
+                  <c:x val="0"/>
+                  <c:y val="-0.045"/>
+                </c:manualLayout>
+              </c:layout>
+              <c:numFmt formatCode="0.0" sourceLinked="0"/>
+              <c:spPr>
+                <a:noFill/>
+                <a:ln>
+                  <a:noFill/>
+                </a:ln>
+              </c:spPr>
+              <c:txPr>
+                <a:bodyPr/>
+                <a:lstStyle/>
+                <a:p>
+                  <a:pPr>
+                    <a:defRPr sz="1050" b="1">
+                      <a:solidFill>
+                        <a:srgbClr val="000000"/>
+                      </a:solidFill>
+                      <a:latin typeface="Times New Roman"/>
+                      <a:cs typeface="Times New Roman"/>
+                    </a:defRPr>
+                  </a:pPr>
+                  <a:endParaRPr lang="uz-Latn-UZ"/>
+                </a:p>
+              </c:txPr>
+              <c:dLblPos val="ctr"/>
+              <c:showLegendKey val="0"/>
+              <c:showVal val="1"/>
+              <c:showCatName val="0"/>
+              <c:showSerName val="0"/>
+              <c:showPercent val="0"/>
+              <c:showBubbleSize val="0"/>
             </c:dLbl>
             <c:numFmt formatCode="0.0" sourceLinked="0"/>
             <c:spPr>
@@ -24626,7 +24661,7 @@
         <c:axId val="222"/>
         <c:scaling>
           <c:orientation val="minMax"/>
-          <c:max val="100"/>
+          <c:max val="105"/>
           <c:min val="0"/>
         </c:scaling>
         <c:delete val="0"/>

</xml_diff>

<commit_message>
2.3.4-rasm namunasi: jami summalar ustunlar ustida
Co-Authored-By: Claude Opus 5.5 <noreply@anthropic.com>
Claude-Session: https://claude.ai/code/session_01PxHTC8Q7yHdrpAeUA5KUgM
</commit_message>
<xml_diff>
--- a/Namuna_2.3.4-rasm.docx
+++ b/Namuna_2.3.4-rasm.docx
@@ -64,7 +64,7 @@
           <w:strike w:val="0"/>
           <w:sz w:val="24"/>
         </w:rPr>
-        <w:t>Izoh: yillar ostida – 3-bosqich kreditlarining jami summasi, mlrd so‘m.</w:t>
+        <w:t>Izoh: ustunlar ustida – 3-bosqich kreditlarining jami summasi, mlrd so‘m.</w:t>
       </w:r>
     </w:p>
     <w:p>
@@ -78,7 +78,7 @@
           <w:strike w:val="0"/>
           <w:sz w:val="24"/>
         </w:rPr>
-        <w:t>Rasm nomida “mlrd so‘m” o‘rniga “2021–2025-yillar, %” (qizil); yillar ostida 3-bosqich kreditlarining jami summasi berilgan. Rasm manbasi (snoska) ga qo‘shiladi:</w:t>
+        <w:t>Rasm nomida “mlrd so‘m” o‘rniga “2021–2025-yillar, %” (qizil); ustunlar ustida 3-bosqich kreditlarining jami summasi berilgan. Rasm manbasi (snoska) ga qo‘shiladi:</w:t>
       </w:r>
     </w:p>
     <w:p>
@@ -24084,24 +24084,19 @@
               <c:strCache>
                 <c:ptCount val="5"/>
                 <c:pt idx="0">
-                  <c:v>2021
-2 778,0</c:v>
+                  <c:v>2021</c:v>
                 </c:pt>
                 <c:pt idx="1">
-                  <c:v>2022
-3 784,1</c:v>
+                  <c:v>2022</c:v>
                 </c:pt>
                 <c:pt idx="2">
-                  <c:v>2023
-2 904,4</c:v>
+                  <c:v>2023</c:v>
                 </c:pt>
                 <c:pt idx="3">
-                  <c:v>2024
-4 085,6</c:v>
+                  <c:v>2024</c:v>
                 </c:pt>
                 <c:pt idx="4">
-                  <c:v>2025
-5 310,2</c:v>
+                  <c:v>2025</c:v>
                 </c:pt>
               </c:strCache>
             </c:strRef>
@@ -24194,24 +24189,19 @@
               <c:strCache>
                 <c:ptCount val="5"/>
                 <c:pt idx="0">
-                  <c:v>2021
-2 778,0</c:v>
+                  <c:v>2021</c:v>
                 </c:pt>
                 <c:pt idx="1">
-                  <c:v>2022
-3 784,1</c:v>
+                  <c:v>2022</c:v>
                 </c:pt>
                 <c:pt idx="2">
-                  <c:v>2023
-2 904,4</c:v>
+                  <c:v>2023</c:v>
                 </c:pt>
                 <c:pt idx="3">
-                  <c:v>2024
-4 085,6</c:v>
+                  <c:v>2024</c:v>
                 </c:pt>
                 <c:pt idx="4">
-                  <c:v>2025
-5 310,2</c:v>
+                  <c:v>2025</c:v>
                 </c:pt>
               </c:strCache>
             </c:strRef>
@@ -24304,24 +24294,19 @@
               <c:strCache>
                 <c:ptCount val="5"/>
                 <c:pt idx="0">
-                  <c:v>2021
-2 778,0</c:v>
+                  <c:v>2021</c:v>
                 </c:pt>
                 <c:pt idx="1">
-                  <c:v>2022
-3 784,1</c:v>
+                  <c:v>2022</c:v>
                 </c:pt>
                 <c:pt idx="2">
-                  <c:v>2023
-2 904,4</c:v>
+                  <c:v>2023</c:v>
                 </c:pt>
                 <c:pt idx="3">
-                  <c:v>2024
-4 085,6</c:v>
+                  <c:v>2024</c:v>
                 </c:pt>
                 <c:pt idx="4">
-                  <c:v>2025
-5 310,2</c:v>
+                  <c:v>2025</c:v>
                 </c:pt>
               </c:strCache>
             </c:strRef>
@@ -24414,24 +24399,19 @@
               <c:strCache>
                 <c:ptCount val="5"/>
                 <c:pt idx="0">
-                  <c:v>2021
-2 778,0</c:v>
+                  <c:v>2021</c:v>
                 </c:pt>
                 <c:pt idx="1">
-                  <c:v>2022
-3 784,1</c:v>
+                  <c:v>2022</c:v>
                 </c:pt>
                 <c:pt idx="2">
-                  <c:v>2023
-2 904,4</c:v>
+                  <c:v>2023</c:v>
                 </c:pt>
                 <c:pt idx="3">
-                  <c:v>2024
-4 085,6</c:v>
+                  <c:v>2024</c:v>
                 </c:pt>
                 <c:pt idx="4">
-                  <c:v>2025
-5 310,2</c:v>
+                  <c:v>2025</c:v>
                 </c:pt>
               </c:strCache>
             </c:strRef>
@@ -24491,8 +24471,8 @@
               <c:idx val="2"/>
               <c:layout>
                 <c:manualLayout>
-                  <c:x val="0"/>
-                  <c:y val="-0.045"/>
+                  <c:x val="0.075"/>
+                  <c:y val="-0.012"/>
                 </c:manualLayout>
               </c:layout>
               <c:numFmt formatCode="0.0" sourceLinked="0"/>
@@ -24563,24 +24543,19 @@
               <c:strCache>
                 <c:ptCount val="5"/>
                 <c:pt idx="0">
-                  <c:v>2021
-2 778,0</c:v>
+                  <c:v>2021</c:v>
                 </c:pt>
                 <c:pt idx="1">
-                  <c:v>2022
-3 784,1</c:v>
+                  <c:v>2022</c:v>
                 </c:pt>
                 <c:pt idx="2">
-                  <c:v>2023
-2 904,4</c:v>
+                  <c:v>2023</c:v>
                 </c:pt>
                 <c:pt idx="3">
-                  <c:v>2024
-4 085,6</c:v>
+                  <c:v>2024</c:v>
                 </c:pt>
                 <c:pt idx="4">
-                  <c:v>2025
-5 310,2</c:v>
+                  <c:v>2025</c:v>
                 </c:pt>
               </c:strCache>
             </c:strRef>
@@ -24615,6 +24590,308 @@
         <c:axId val="111"/>
         <c:axId val="222"/>
       </c:barChart>
+      <c:lineChart>
+        <c:grouping val="standard"/>
+        <c:varyColors val="0"/>
+        <c:ser>
+          <c:idx val="5"/>
+          <c:order val="5"/>
+          <c:tx>
+            <c:strRef>
+              <c:f>Sheet1!$G$1</c:f>
+              <c:strCache>
+                <c:ptCount val="1"/>
+                <c:pt idx="0">
+                  <c:v>Jami, mlrd so‘m</c:v>
+                </c:pt>
+              </c:strCache>
+            </c:strRef>
+          </c:tx>
+          <c:spPr>
+            <a:ln>
+              <a:noFill/>
+            </a:ln>
+          </c:spPr>
+          <c:marker>
+            <c:symbol val="none"/>
+          </c:marker>
+          <c:dLbls>
+            <c:dLbl>
+              <c:idx val="0"/>
+              <c:tx>
+                <c:rich>
+                  <a:bodyPr/>
+                  <a:lstStyle/>
+                  <a:p>
+                    <a:pPr>
+                      <a:defRPr sz="1050" b="1">
+                        <a:solidFill>
+                          <a:srgbClr val="1F3864"/>
+                        </a:solidFill>
+                        <a:latin typeface="Times New Roman"/>
+                        <a:cs typeface="Times New Roman"/>
+                      </a:defRPr>
+                    </a:pPr>
+                    <a:r>
+                      <a:rPr lang="uz-Latn-UZ" sz="1050" b="1">
+                        <a:solidFill>
+                          <a:srgbClr val="1F3864"/>
+                        </a:solidFill>
+                        <a:latin typeface="Times New Roman"/>
+                      </a:rPr>
+                      <a:t>2 778,0</a:t>
+                    </a:r>
+                  </a:p>
+                </c:rich>
+              </c:tx>
+              <c:spPr>
+                <a:noFill/>
+                <a:ln>
+                  <a:noFill/>
+                </a:ln>
+              </c:spPr>
+              <c:dLblPos val="ctr"/>
+              <c:showLegendKey val="0"/>
+              <c:showVal val="1"/>
+              <c:showCatName val="0"/>
+              <c:showSerName val="0"/>
+              <c:showPercent val="0"/>
+              <c:showBubbleSize val="0"/>
+            </c:dLbl>
+            <c:dLbl>
+              <c:idx val="1"/>
+              <c:tx>
+                <c:rich>
+                  <a:bodyPr/>
+                  <a:lstStyle/>
+                  <a:p>
+                    <a:pPr>
+                      <a:defRPr sz="1050" b="1">
+                        <a:solidFill>
+                          <a:srgbClr val="1F3864"/>
+                        </a:solidFill>
+                        <a:latin typeface="Times New Roman"/>
+                        <a:cs typeface="Times New Roman"/>
+                      </a:defRPr>
+                    </a:pPr>
+                    <a:r>
+                      <a:rPr lang="uz-Latn-UZ" sz="1050" b="1">
+                        <a:solidFill>
+                          <a:srgbClr val="1F3864"/>
+                        </a:solidFill>
+                        <a:latin typeface="Times New Roman"/>
+                      </a:rPr>
+                      <a:t>3 784,1</a:t>
+                    </a:r>
+                  </a:p>
+                </c:rich>
+              </c:tx>
+              <c:spPr>
+                <a:noFill/>
+                <a:ln>
+                  <a:noFill/>
+                </a:ln>
+              </c:spPr>
+              <c:dLblPos val="ctr"/>
+              <c:showLegendKey val="0"/>
+              <c:showVal val="1"/>
+              <c:showCatName val="0"/>
+              <c:showSerName val="0"/>
+              <c:showPercent val="0"/>
+              <c:showBubbleSize val="0"/>
+            </c:dLbl>
+            <c:dLbl>
+              <c:idx val="2"/>
+              <c:tx>
+                <c:rich>
+                  <a:bodyPr/>
+                  <a:lstStyle/>
+                  <a:p>
+                    <a:pPr>
+                      <a:defRPr sz="1050" b="1">
+                        <a:solidFill>
+                          <a:srgbClr val="1F3864"/>
+                        </a:solidFill>
+                        <a:latin typeface="Times New Roman"/>
+                        <a:cs typeface="Times New Roman"/>
+                      </a:defRPr>
+                    </a:pPr>
+                    <a:r>
+                      <a:rPr lang="uz-Latn-UZ" sz="1050" b="1">
+                        <a:solidFill>
+                          <a:srgbClr val="1F3864"/>
+                        </a:solidFill>
+                        <a:latin typeface="Times New Roman"/>
+                      </a:rPr>
+                      <a:t>2 904,4</a:t>
+                    </a:r>
+                  </a:p>
+                </c:rich>
+              </c:tx>
+              <c:spPr>
+                <a:noFill/>
+                <a:ln>
+                  <a:noFill/>
+                </a:ln>
+              </c:spPr>
+              <c:dLblPos val="ctr"/>
+              <c:showLegendKey val="0"/>
+              <c:showVal val="1"/>
+              <c:showCatName val="0"/>
+              <c:showSerName val="0"/>
+              <c:showPercent val="0"/>
+              <c:showBubbleSize val="0"/>
+            </c:dLbl>
+            <c:dLbl>
+              <c:idx val="3"/>
+              <c:tx>
+                <c:rich>
+                  <a:bodyPr/>
+                  <a:lstStyle/>
+                  <a:p>
+                    <a:pPr>
+                      <a:defRPr sz="1050" b="1">
+                        <a:solidFill>
+                          <a:srgbClr val="1F3864"/>
+                        </a:solidFill>
+                        <a:latin typeface="Times New Roman"/>
+                        <a:cs typeface="Times New Roman"/>
+                      </a:defRPr>
+                    </a:pPr>
+                    <a:r>
+                      <a:rPr lang="uz-Latn-UZ" sz="1050" b="1">
+                        <a:solidFill>
+                          <a:srgbClr val="1F3864"/>
+                        </a:solidFill>
+                        <a:latin typeface="Times New Roman"/>
+                      </a:rPr>
+                      <a:t>4 085,6</a:t>
+                    </a:r>
+                  </a:p>
+                </c:rich>
+              </c:tx>
+              <c:spPr>
+                <a:noFill/>
+                <a:ln>
+                  <a:noFill/>
+                </a:ln>
+              </c:spPr>
+              <c:dLblPos val="ctr"/>
+              <c:showLegendKey val="0"/>
+              <c:showVal val="1"/>
+              <c:showCatName val="0"/>
+              <c:showSerName val="0"/>
+              <c:showPercent val="0"/>
+              <c:showBubbleSize val="0"/>
+            </c:dLbl>
+            <c:dLbl>
+              <c:idx val="4"/>
+              <c:tx>
+                <c:rich>
+                  <a:bodyPr/>
+                  <a:lstStyle/>
+                  <a:p>
+                    <a:pPr>
+                      <a:defRPr sz="1050" b="1">
+                        <a:solidFill>
+                          <a:srgbClr val="1F3864"/>
+                        </a:solidFill>
+                        <a:latin typeface="Times New Roman"/>
+                        <a:cs typeface="Times New Roman"/>
+                      </a:defRPr>
+                    </a:pPr>
+                    <a:r>
+                      <a:rPr lang="uz-Latn-UZ" sz="1050" b="1">
+                        <a:solidFill>
+                          <a:srgbClr val="1F3864"/>
+                        </a:solidFill>
+                        <a:latin typeface="Times New Roman"/>
+                      </a:rPr>
+                      <a:t>5 310,2</a:t>
+                    </a:r>
+                  </a:p>
+                </c:rich>
+              </c:tx>
+              <c:spPr>
+                <a:noFill/>
+                <a:ln>
+                  <a:noFill/>
+                </a:ln>
+              </c:spPr>
+              <c:dLblPos val="ctr"/>
+              <c:showLegendKey val="0"/>
+              <c:showVal val="1"/>
+              <c:showCatName val="0"/>
+              <c:showSerName val="0"/>
+              <c:showPercent val="0"/>
+              <c:showBubbleSize val="0"/>
+            </c:dLbl>
+            <c:spPr>
+              <a:noFill/>
+              <a:ln>
+                <a:noFill/>
+              </a:ln>
+            </c:spPr>
+            <c:showLegendKey val="0"/>
+            <c:showVal val="1"/>
+            <c:showCatName val="0"/>
+            <c:showSerName val="0"/>
+            <c:showPercent val="0"/>
+            <c:showBubbleSize val="0"/>
+          </c:dLbls>
+          <c:cat>
+            <c:strRef>
+              <c:f>Sheet1!$A$2:$A$6</c:f>
+              <c:strCache>
+                <c:ptCount val="5"/>
+                <c:pt idx="0">
+                  <c:v>2021</c:v>
+                </c:pt>
+                <c:pt idx="1">
+                  <c:v>2022</c:v>
+                </c:pt>
+                <c:pt idx="2">
+                  <c:v>2023</c:v>
+                </c:pt>
+                <c:pt idx="3">
+                  <c:v>2024</c:v>
+                </c:pt>
+                <c:pt idx="4">
+                  <c:v>2025</c:v>
+                </c:pt>
+              </c:strCache>
+            </c:strRef>
+          </c:cat>
+          <c:val>
+            <c:numRef>
+              <c:f>Sheet1!$G$2:$G$6</c:f>
+              <c:numCache>
+                <c:formatCode>General</c:formatCode>
+                <c:ptCount val="5"/>
+                <c:pt idx="0">
+                  <c:v>109</c:v>
+                </c:pt>
+                <c:pt idx="1">
+                  <c:v>109</c:v>
+                </c:pt>
+                <c:pt idx="2">
+                  <c:v>109</c:v>
+                </c:pt>
+                <c:pt idx="3">
+                  <c:v>109</c:v>
+                </c:pt>
+                <c:pt idx="4">
+                  <c:v>109</c:v>
+                </c:pt>
+              </c:numCache>
+            </c:numRef>
+          </c:val>
+          <c:smooth val="0"/>
+        </c:ser>
+        <c:marker val="1"/>
+        <c:axId val="111"/>
+        <c:axId val="222"/>
+      </c:lineChart>
       <c:catAx>
         <c:axId val="111"/>
         <c:scaling>
@@ -24661,7 +24938,7 @@
         <c:axId val="222"/>
         <c:scaling>
           <c:orientation val="minMax"/>
-          <c:max val="105"/>
+          <c:max val="114"/>
           <c:min val="0"/>
         </c:scaling>
         <c:delete val="0"/>
@@ -24745,6 +25022,10 @@
     </c:plotArea>
     <c:legend>
       <c:legendPos val="b"/>
+      <c:legendEntry>
+        <c:idx val="5"/>
+        <c:delete val="1"/>
+      </c:legendEntry>
       <c:overlay val="0"/>
       <c:txPr>
         <a:bodyPr/>

</xml_diff>